<commit_message>
Backup 2026-02-27: Batches 5A/5B, Apollo analysis, intent pipeline, email SOP, templates
New batch trackers: 5A (25 FinServ/Insurance) and 5B (25 multi-vertical).
Apollo operations: contacts export, sequences data, comprehensive stats.
Intent pipeline: transferred accounts, Mastercard account map, intent sequences.
Email SOP: interactive HTML playbook + Word doc for team distribution.
Template library v2.0, daily execution guides, outreach stats engine.
Updated CLAUDE.md with email SOP section and key deliverables index.

Co-Authored-By: Claude Opus 4.6 <noreply@anthropic.com>
</commit_message>
<xml_diff>
--- a/bdr-automation-pipeline-sop.docx
+++ b/bdr-automation-pipeline-sop.docx
@@ -17330,7 +17330,7 @@
           <w:sz w:val="32"/>
           <w:szCs w:val="32"/>
         </w:rPr>
-        <w:t xml:space="preserve">13. Reference: LinkedIn Safety and Compliance</w:t>
+        <w:t xml:space="preserve">13. Email-Only Sequence SOP (BDR-Wide Apollo Use)</w:t>
       </w:r>
     </w:p>
     <w:p>
@@ -17342,16 +17342,16 @@
         <w:rPr>
           <w:rFonts w:ascii="Arial" w:cs="Arial" w:eastAsia="Arial" w:hAnsi="Arial"/>
           <w:color w:val="2C3E50"/>
-          <w:sz w:val="21"/>
-          <w:szCs w:val="21"/>
-        </w:rPr>
-        <w:t xml:space="preserve">Our workflow is human-in-the-loop and compliant with LinkedIn policies. Claude drafts, Rob reviews and manually sends.</w:t>
+          <w:sz w:val="22"/>
+          <w:szCs w:val="22"/>
+        </w:rPr>
+        <w:t xml:space="preserve">This section defines the standalone email-only outreach cadence for use in Apollo sequences across the BDR team. Unlike the multi-channel InMail + Email sequence, this is a 5-touch email sequence any BDR can run through Apollo. All data-driven rules from the Outbound Intelligence System apply.</w:t>
       </w:r>
     </w:p>
     <w:p>
       <w:pPr>
         <w:pStyle w:val="Heading2"/>
-        <w:spacing w:after="160" w:before="280"/>
+        <w:spacing w:after="160" w:before="240"/>
       </w:pPr>
       <w:r>
         <w:rPr>
@@ -17362,7 +17362,647 @@
           <w:sz w:val="26"/>
           <w:szCs w:val="26"/>
         </w:rPr>
-        <w:t xml:space="preserve">13.1 Core Rules</w:t>
+        <w:t xml:space="preserve">13.1 Email-Specific Hard Constraints</w:t>
+      </w:r>
+    </w:p>
+    <w:p>
+      <w:pPr>
+        <w:spacing w:after="80"/>
+      </w:pPr>
+      <w:r>
+        <w:rPr>
+          <w:rFonts w:ascii="Arial" w:cs="Arial" w:eastAsia="Arial" w:hAnsi="Arial"/>
+          <w:color w:val="2C3E50"/>
+          <w:sz w:val="22"/>
+          <w:szCs w:val="22"/>
+        </w:rPr>
+        <w:t xml:space="preserve">In addition to HC1-HC10, email sequences must follow these constraints: EC1: Email Touch 1 max 100 words (60-80 optimal). EC2: Follow-up emails max 70 words. EC3: Subject lines 5-6 words, problem-framed, domain-specific. EC4: 1-2 question marks per email. EC5: No “circling back” or “following up on my last email” phrasing.</w:t>
+      </w:r>
+    </w:p>
+    <w:p>
+      <w:pPr>
+        <w:pStyle w:val="Heading2"/>
+        <w:spacing w:after="160" w:before="240"/>
+      </w:pPr>
+      <w:r>
+        <w:rPr>
+          <w:rFonts w:ascii="Arial" w:cs="Arial" w:eastAsia="Arial" w:hAnsi="Arial"/>
+          <w:b/>
+          <w:bCs/>
+          <w:color w:val="1B4F72"/>
+          <w:sz w:val="26"/>
+          <w:szCs w:val="26"/>
+        </w:rPr>
+        <w:t xml:space="preserve">13.2 Five-Touch 21-Day Email Cadence</w:t>
+      </w:r>
+    </w:p>
+    <w:tbl>
+      <w:tblPr>
+        <w:tblW w:type="dxa" w:w="9360"/>
+        <w:tblBorders>
+          <w:top w:color="CCCCCC" w:space="0" w:sz="4" w:val="single"/>
+          <w:left w:color="CCCCCC" w:space="0" w:sz="4" w:val="single"/>
+          <w:bottom w:color="CCCCCC" w:space="0" w:sz="4" w:val="single"/>
+          <w:right w:color="CCCCCC" w:space="0" w:sz="4" w:val="single"/>
+          <w:insideH w:color="CCCCCC" w:space="0" w:sz="4" w:val="single"/>
+          <w:insideV w:color="CCCCCC" w:space="0" w:sz="4" w:val="single"/>
+        </w:tblBorders>
+      </w:tblPr>
+      <w:tblGrid>
+        <w:gridCol w:w="1200"/>
+        <w:gridCol w:w="900"/>
+        <w:gridCol w:w="2000"/>
+        <w:gridCol w:w="1200"/>
+        <w:gridCol w:w="4060"/>
+      </w:tblGrid>
+      <w:tr>
+        <w:tc>
+          <w:tcPr>
+            <w:tcW w:type="dxa" w:w="1200"/>
+            <w:shd w:fill="1B4F72" w:val="clear"/>
+          </w:tcPr>
+          <w:p>
+            <w:r>
+              <w:rPr>
+                <w:rFonts w:ascii="Arial" w:hAnsi="Arial"/>
+                <w:b/>
+                <w:color w:val="FFFFFF"/>
+                <w:sz w:val="18"/>
+              </w:rPr>
+              <w:t>Touch</w:t>
+            </w:r>
+          </w:p>
+        </w:tc>
+        <w:tc>
+          <w:tcPr>
+            <w:tcW w:type="dxa" w:w="900"/>
+            <w:shd w:fill="1B4F72" w:val="clear"/>
+          </w:tcPr>
+          <w:p>
+            <w:r>
+              <w:rPr>
+                <w:rFonts w:ascii="Arial" w:hAnsi="Arial"/>
+                <w:b/>
+                <w:color w:val="FFFFFF"/>
+                <w:sz w:val="18"/>
+              </w:rPr>
+              <w:t>Day</w:t>
+            </w:r>
+          </w:p>
+        </w:tc>
+        <w:tc>
+          <w:tcPr>
+            <w:tcW w:type="dxa" w:w="2000"/>
+            <w:shd w:fill="1B4F72" w:val="clear"/>
+          </w:tcPr>
+          <w:p>
+            <w:r>
+              <w:rPr>
+                <w:rFonts w:ascii="Arial" w:hAnsi="Arial"/>
+                <w:b/>
+                <w:color w:val="FFFFFF"/>
+                <w:sz w:val="18"/>
+              </w:rPr>
+              <w:t>Type</w:t>
+            </w:r>
+          </w:p>
+        </w:tc>
+        <w:tc>
+          <w:tcPr>
+            <w:tcW w:type="dxa" w:w="1200"/>
+            <w:shd w:fill="1B4F72" w:val="clear"/>
+          </w:tcPr>
+          <w:p>
+            <w:r>
+              <w:rPr>
+                <w:rFonts w:ascii="Arial" w:hAnsi="Arial"/>
+                <w:b/>
+                <w:color w:val="FFFFFF"/>
+                <w:sz w:val="18"/>
+              </w:rPr>
+              <w:t>Words</w:t>
+            </w:r>
+          </w:p>
+        </w:tc>
+        <w:tc>
+          <w:tcPr>
+            <w:tcW w:type="dxa" w:w="4060"/>
+            <w:shd w:fill="1B4F72" w:val="clear"/>
+          </w:tcPr>
+          <w:p>
+            <w:r>
+              <w:rPr>
+                <w:rFonts w:ascii="Arial" w:hAnsi="Arial"/>
+                <w:b/>
+                <w:color w:val="FFFFFF"/>
+                <w:sz w:val="18"/>
+              </w:rPr>
+              <w:t>Purpose</w:t>
+            </w:r>
+          </w:p>
+        </w:tc>
+      </w:tr>
+      <w:tr>
+        <w:tc>
+          <w:tcPr>
+            <w:tcW w:type="dxa" w:w="1200"/>
+          </w:tcPr>
+          <w:p>
+            <w:r>
+              <w:rPr>
+                <w:rFonts w:ascii="Arial" w:hAnsi="Arial"/>
+                <w:sz w:val="19"/>
+              </w:rPr>
+              <w:t>1</w:t>
+            </w:r>
+          </w:p>
+        </w:tc>
+        <w:tc>
+          <w:tcPr>
+            <w:tcW w:type="dxa" w:w="900"/>
+          </w:tcPr>
+          <w:p>
+            <w:r>
+              <w:rPr>
+                <w:rFonts w:ascii="Arial" w:hAnsi="Arial"/>
+                <w:sz w:val="19"/>
+              </w:rPr>
+              <w:t>Day 1</w:t>
+            </w:r>
+          </w:p>
+        </w:tc>
+        <w:tc>
+          <w:tcPr>
+            <w:tcW w:type="dxa" w:w="2000"/>
+          </w:tcPr>
+          <w:p>
+            <w:r>
+              <w:rPr>
+                <w:rFonts w:ascii="Arial" w:hAnsi="Arial"/>
+                <w:sz w:val="19"/>
+              </w:rPr>
+              <w:t>Problem Hook</w:t>
+            </w:r>
+          </w:p>
+        </w:tc>
+        <w:tc>
+          <w:tcPr>
+            <w:tcW w:type="dxa" w:w="1200"/>
+          </w:tcPr>
+          <w:p>
+            <w:r>
+              <w:rPr>
+                <w:rFonts w:ascii="Arial" w:hAnsi="Arial"/>
+                <w:sz w:val="19"/>
+              </w:rPr>
+              <w:t>60-100</w:t>
+            </w:r>
+          </w:p>
+        </w:tc>
+        <w:tc>
+          <w:tcPr>
+            <w:tcW w:type="dxa" w:w="4060"/>
+          </w:tcPr>
+          <w:p>
+            <w:r>
+              <w:rPr>
+                <w:rFonts w:ascii="Arial" w:hAnsi="Arial"/>
+                <w:sz w:val="19"/>
+              </w:rPr>
+              <w:t xml:space="preserve">Lead with QA pain question, one proof point, “what day works” close</w:t>
+            </w:r>
+          </w:p>
+        </w:tc>
+      </w:tr>
+      <w:tr>
+        <w:tc>
+          <w:tcPr>
+            <w:tcW w:type="dxa" w:w="1200"/>
+          </w:tcPr>
+          <w:p>
+            <w:r>
+              <w:rPr>
+                <w:rFonts w:ascii="Arial" w:hAnsi="Arial"/>
+                <w:sz w:val="19"/>
+              </w:rPr>
+              <w:t>2</w:t>
+            </w:r>
+          </w:p>
+        </w:tc>
+        <w:tc>
+          <w:tcPr>
+            <w:tcW w:type="dxa" w:w="900"/>
+          </w:tcPr>
+          <w:p>
+            <w:r>
+              <w:rPr>
+                <w:rFonts w:ascii="Arial" w:hAnsi="Arial"/>
+                <w:sz w:val="19"/>
+              </w:rPr>
+              <w:t>Day 4</w:t>
+            </w:r>
+          </w:p>
+        </w:tc>
+        <w:tc>
+          <w:tcPr>
+            <w:tcW w:type="dxa" w:w="2000"/>
+          </w:tcPr>
+          <w:p>
+            <w:r>
+              <w:rPr>
+                <w:rFonts w:ascii="Arial" w:hAnsi="Arial"/>
+                <w:sz w:val="19"/>
+              </w:rPr>
+              <w:t>Value Add</w:t>
+            </w:r>
+          </w:p>
+        </w:tc>
+        <w:tc>
+          <w:tcPr>
+            <w:tcW w:type="dxa" w:w="1200"/>
+          </w:tcPr>
+          <w:p>
+            <w:r>
+              <w:rPr>
+                <w:rFonts w:ascii="Arial" w:hAnsi="Arial"/>
+                <w:sz w:val="19"/>
+              </w:rPr>
+              <w:t>40-70</w:t>
+            </w:r>
+          </w:p>
+        </w:tc>
+        <w:tc>
+          <w:tcPr>
+            <w:tcW w:type="dxa" w:w="4060"/>
+          </w:tcPr>
+          <w:p>
+            <w:r>
+              <w:rPr>
+                <w:rFonts w:ascii="Arial" w:hAnsi="Arial"/>
+                <w:sz w:val="19"/>
+              </w:rPr>
+              <w:t>New angle, different proof point, lighter close</w:t>
+            </w:r>
+          </w:p>
+        </w:tc>
+      </w:tr>
+      <w:tr>
+        <w:tc>
+          <w:tcPr>
+            <w:tcW w:type="dxa" w:w="1200"/>
+          </w:tcPr>
+          <w:p>
+            <w:r>
+              <w:rPr>
+                <w:rFonts w:ascii="Arial" w:hAnsi="Arial"/>
+                <w:sz w:val="19"/>
+              </w:rPr>
+              <w:t>3</w:t>
+            </w:r>
+          </w:p>
+        </w:tc>
+        <w:tc>
+          <w:tcPr>
+            <w:tcW w:type="dxa" w:w="900"/>
+          </w:tcPr>
+          <w:p>
+            <w:r>
+              <w:rPr>
+                <w:rFonts w:ascii="Arial" w:hAnsi="Arial"/>
+                <w:sz w:val="19"/>
+              </w:rPr>
+              <w:t>Day 9</w:t>
+            </w:r>
+          </w:p>
+        </w:tc>
+        <w:tc>
+          <w:tcPr>
+            <w:tcW w:type="dxa" w:w="2000"/>
+          </w:tcPr>
+          <w:p>
+            <w:r>
+              <w:rPr>
+                <w:rFonts w:ascii="Arial" w:hAnsi="Arial"/>
+                <w:sz w:val="19"/>
+              </w:rPr>
+              <w:t>Social Proof</w:t>
+            </w:r>
+          </w:p>
+        </w:tc>
+        <w:tc>
+          <w:tcPr>
+            <w:tcW w:type="dxa" w:w="1200"/>
+          </w:tcPr>
+          <w:p>
+            <w:r>
+              <w:rPr>
+                <w:rFonts w:ascii="Arial" w:hAnsi="Arial"/>
+                <w:sz w:val="19"/>
+              </w:rPr>
+              <w:t>60-100</w:t>
+            </w:r>
+          </w:p>
+        </w:tc>
+        <w:tc>
+          <w:tcPr>
+            <w:tcW w:type="dxa" w:w="4060"/>
+          </w:tcPr>
+          <w:p>
+            <w:r>
+              <w:rPr>
+                <w:rFonts w:ascii="Arial" w:hAnsi="Arial"/>
+                <w:sz w:val="19"/>
+              </w:rPr>
+              <w:t>Customer story focus, specific numbers, vertical match</w:t>
+            </w:r>
+          </w:p>
+        </w:tc>
+      </w:tr>
+      <w:tr>
+        <w:tc>
+          <w:tcPr>
+            <w:tcW w:type="dxa" w:w="1200"/>
+          </w:tcPr>
+          <w:p>
+            <w:r>
+              <w:rPr>
+                <w:rFonts w:ascii="Arial" w:hAnsi="Arial"/>
+                <w:sz w:val="19"/>
+              </w:rPr>
+              <w:t>4</w:t>
+            </w:r>
+          </w:p>
+        </w:tc>
+        <w:tc>
+          <w:tcPr>
+            <w:tcW w:type="dxa" w:w="900"/>
+          </w:tcPr>
+          <w:p>
+            <w:r>
+              <w:rPr>
+                <w:rFonts w:ascii="Arial" w:hAnsi="Arial"/>
+                <w:sz w:val="19"/>
+              </w:rPr>
+              <w:t>Day 14</w:t>
+            </w:r>
+          </w:p>
+        </w:tc>
+        <w:tc>
+          <w:tcPr>
+            <w:tcW w:type="dxa" w:w="2000"/>
+          </w:tcPr>
+          <w:p>
+            <w:r>
+              <w:rPr>
+                <w:rFonts w:ascii="Arial" w:hAnsi="Arial"/>
+                <w:sz w:val="19"/>
+              </w:rPr>
+              <w:t>Trigger/Timely</w:t>
+            </w:r>
+          </w:p>
+        </w:tc>
+        <w:tc>
+          <w:tcPr>
+            <w:tcW w:type="dxa" w:w="1200"/>
+          </w:tcPr>
+          <w:p>
+            <w:r>
+              <w:rPr>
+                <w:rFonts w:ascii="Arial" w:hAnsi="Arial"/>
+                <w:sz w:val="19"/>
+              </w:rPr>
+              <w:t>40-70</w:t>
+            </w:r>
+          </w:p>
+        </w:tc>
+        <w:tc>
+          <w:tcPr>
+            <w:tcW w:type="dxa" w:w="4060"/>
+          </w:tcPr>
+          <w:p>
+            <w:r>
+              <w:rPr>
+                <w:rFonts w:ascii="Arial" w:hAnsi="Arial"/>
+                <w:sz w:val="19"/>
+              </w:rPr>
+              <w:t>Recent company event or industry trend reference</w:t>
+            </w:r>
+          </w:p>
+        </w:tc>
+      </w:tr>
+      <w:tr>
+        <w:tc>
+          <w:tcPr>
+            <w:tcW w:type="dxa" w:w="1200"/>
+          </w:tcPr>
+          <w:p>
+            <w:r>
+              <w:rPr>
+                <w:rFonts w:ascii="Arial" w:hAnsi="Arial"/>
+                <w:sz w:val="19"/>
+              </w:rPr>
+              <w:t>5</w:t>
+            </w:r>
+          </w:p>
+        </w:tc>
+        <w:tc>
+          <w:tcPr>
+            <w:tcW w:type="dxa" w:w="900"/>
+          </w:tcPr>
+          <w:p>
+            <w:r>
+              <w:rPr>
+                <w:rFonts w:ascii="Arial" w:hAnsi="Arial"/>
+                <w:sz w:val="19"/>
+              </w:rPr>
+              <w:t>Day 21</w:t>
+            </w:r>
+          </w:p>
+        </w:tc>
+        <w:tc>
+          <w:tcPr>
+            <w:tcW w:type="dxa" w:w="2000"/>
+          </w:tcPr>
+          <w:p>
+            <w:r>
+              <w:rPr>
+                <w:rFonts w:ascii="Arial" w:hAnsi="Arial"/>
+                <w:sz w:val="19"/>
+              </w:rPr>
+              <w:t>Direct Ask</w:t>
+            </w:r>
+          </w:p>
+        </w:tc>
+        <w:tc>
+          <w:tcPr>
+            <w:tcW w:type="dxa" w:w="1200"/>
+          </w:tcPr>
+          <w:p>
+            <w:r>
+              <w:rPr>
+                <w:rFonts w:ascii="Arial" w:hAnsi="Arial"/>
+                <w:sz w:val="19"/>
+              </w:rPr>
+              <w:t>40-60</w:t>
+            </w:r>
+          </w:p>
+        </w:tc>
+        <w:tc>
+          <w:tcPr>
+            <w:tcW w:type="dxa" w:w="4060"/>
+          </w:tcPr>
+          <w:p>
+            <w:r>
+              <w:rPr>
+                <w:rFonts w:ascii="Arial" w:hAnsi="Arial"/>
+                <w:sz w:val="19"/>
+              </w:rPr>
+              <w:t>Shortest touch, one sentence of value, confident close</w:t>
+            </w:r>
+          </w:p>
+        </w:tc>
+      </w:tr>
+    </w:tbl>
+    <w:p>
+      <w:pPr>
+        <w:pStyle w:val="Heading2"/>
+        <w:spacing w:after="160" w:before="240"/>
+      </w:pPr>
+      <w:r>
+        <w:rPr>
+          <w:rFonts w:ascii="Arial" w:cs="Arial" w:eastAsia="Arial" w:hAnsi="Arial"/>
+          <w:b/>
+          <w:bCs/>
+          <w:color w:val="1B4F72"/>
+          <w:sz w:val="26"/>
+          <w:szCs w:val="26"/>
+        </w:rPr>
+        <w:t xml:space="preserve">13.3 Apollo Configuration for Email Sequences</w:t>
+      </w:r>
+    </w:p>
+    <w:p>
+      <w:pPr>
+        <w:spacing w:after="80"/>
+      </w:pPr>
+      <w:r>
+        <w:rPr>
+          <w:rFonts w:ascii="Arial" w:cs="Arial" w:eastAsia="Arial" w:hAnsi="Arial"/>
+          <w:color w:val="2C3E50"/>
+          <w:sz w:val="22"/>
+          <w:szCs w:val="22"/>
+        </w:rPr>
+        <w:t xml:space="preserve">Send window: 11:30 AM to 1:30 PM recipient local time (lunch window: 56.5% reply rate). Preferred days: Thursday (42.1%), Tuesday (29.6%), Friday (29.6%). Avoid Monday (22.9%). Daily send limit per mailbox: 25 emails max. Rotate across all 4 linked accounts. Open tracking ON, click tracking OFF (reduces spam score). Unsubscribe link required for CAN-SPAM compliance.</w:t>
+      </w:r>
+    </w:p>
+    <w:p>
+      <w:pPr>
+        <w:pStyle w:val="Heading2"/>
+        <w:spacing w:after="160" w:before="240"/>
+      </w:pPr>
+      <w:r>
+        <w:rPr>
+          <w:rFonts w:ascii="Arial" w:cs="Arial" w:eastAsia="Arial" w:hAnsi="Arial"/>
+          <w:b/>
+          <w:bCs/>
+          <w:color w:val="1B4F72"/>
+          <w:sz w:val="26"/>
+          <w:szCs w:val="26"/>
+        </w:rPr>
+        <w:t xml:space="preserve">13.4 Email Template Selection Guide</w:t>
+      </w:r>
+    </w:p>
+    <w:p>
+      <w:pPr>
+        <w:spacing w:after="80"/>
+      </w:pPr>
+      <w:r>
+        <w:rPr>
+          <w:rFonts w:ascii="Arial" w:cs="Arial" w:eastAsia="Arial" w:hAnsi="Arial"/>
+          <w:color w:val="2C3E50"/>
+          <w:sz w:val="22"/>
+          <w:szCs w:val="22"/>
+        </w:rPr>
+        <w:t xml:space="preserve">Select Touch 1 template by pain hook: EM-1 (Test Maintenance, for teams on Selenium/Cypress/Playwright), EM-2 (Release Velocity, for fast-shipping teams with release delays), EM-3 (Coverage/Scale, for growing teams with coverage gaps), EM-4 (Tool Migration, for teams on TOSCA/Katalon/Provar), EM-5 (Trigger Event, for recent migrations, acquisitions, or QA hiring). Follow-up templates: EM-FU-1 (new proof point), EM-FU-2 (capability match), EM-FU-3 (industry angle), EM-FU-4 (direct ask). Full template text in TEMPLATE_LIBRARY.md and email-sequence-sop.html.</w:t>
+      </w:r>
+    </w:p>
+    <w:p>
+      <w:pPr>
+        <w:pStyle w:val="Heading2"/>
+        <w:spacing w:after="160" w:before="240"/>
+      </w:pPr>
+      <w:r>
+        <w:rPr>
+          <w:rFonts w:ascii="Arial" w:cs="Arial" w:eastAsia="Arial" w:hAnsi="Arial"/>
+          <w:b/>
+          <w:bCs/>
+          <w:color w:val="1B4F72"/>
+          <w:sz w:val="26"/>
+          <w:szCs w:val="26"/>
+        </w:rPr>
+        <w:t xml:space="preserve">13.5 Email Subject Line Patterns</w:t>
+      </w:r>
+    </w:p>
+    <w:p>
+      <w:pPr>
+        <w:spacing w:after="80"/>
+      </w:pPr>
+      <w:r>
+        <w:rPr>
+          <w:rFonts w:ascii="Arial" w:cs="Arial" w:eastAsia="Arial" w:hAnsi="Arial"/>
+          <w:color w:val="2C3E50"/>
+          <w:sz w:val="22"/>
+          <w:szCs w:val="22"/>
+        </w:rPr>
+        <w:t xml:space="preserve">Data-backed patterns: Problem-framed (“Regression eating release time?”) for maintenance/velocity pain. Outcome-framed (“3 fewer weeks of regression”) when strong proof point match. Question format (“What breaks first after the migration?”) for trigger event prospects. Domain-specific (“QA coverage for the payments platform”) when you know their product. Banned: “Quick question” (overused), “Following up” (spam trigger), anything over 8 words, clickbait, all-caps.</w:t>
+      </w:r>
+    </w:p>
+    <w:p>
+      <w:pPr>
+        <w:pStyle w:val="Heading1"/>
+        <w:spacing w:after="200" w:before="360"/>
+      </w:pPr>
+      <w:r>
+        <w:rPr>
+          <w:rFonts w:ascii="Arial" w:cs="Arial" w:eastAsia="Arial" w:hAnsi="Arial"/>
+          <w:b/>
+          <w:bCs/>
+          <w:color w:val="1B4F72"/>
+          <w:sz w:val="32"/>
+          <w:szCs w:val="32"/>
+        </w:rPr>
+        <w:t xml:space="preserve">14. Reference: LinkedIn Safety and Compliance</w:t>
+      </w:r>
+    </w:p>
+    <w:p>
+      <w:pPr>
+        <w:spacing w:after="120"/>
+        <w:jc w:val="left"/>
+      </w:pPr>
+      <w:r>
+        <w:rPr>
+          <w:rFonts w:ascii="Arial" w:cs="Arial" w:eastAsia="Arial" w:hAnsi="Arial"/>
+          <w:color w:val="2C3E50"/>
+          <w:sz w:val="21"/>
+          <w:szCs w:val="21"/>
+        </w:rPr>
+        <w:t xml:space="preserve">Our workflow is human-in-the-loop and compliant with LinkedIn policies. Claude drafts, Rob reviews and manually sends.</w:t>
+      </w:r>
+    </w:p>
+    <w:p>
+      <w:pPr>
+        <w:pStyle w:val="Heading2"/>
+        <w:spacing w:after="160" w:before="280"/>
+      </w:pPr>
+      <w:r>
+        <w:rPr>
+          <w:rFonts w:ascii="Arial" w:cs="Arial" w:eastAsia="Arial" w:hAnsi="Arial"/>
+          <w:b/>
+          <w:bCs/>
+          <w:color w:val="1B4F72"/>
+          <w:sz w:val="26"/>
+          <w:szCs w:val="26"/>
+        </w:rPr>
+        <w:t xml:space="preserve">14.1 Core Rules</w:t>
       </w:r>
     </w:p>
     <w:p>
@@ -17493,7 +18133,7 @@
           <w:sz w:val="26"/>
           <w:szCs w:val="26"/>
         </w:rPr>
-        <w:t xml:space="preserve">13.2 Recovery Protocol</w:t>
+        <w:t xml:space="preserve">14.2 Recovery Protocol</w:t>
       </w:r>
     </w:p>
     <w:p>

</xml_diff>